<commit_message>
Agent Host changes for agents/material-return-tagging-feature
</commit_message>
<xml_diff>
--- a/Yonas_Girma_Internship_Report_Revised.docx
+++ b/Yonas_Girma_Internship_Report_Revised.docx
@@ -19,12 +19,12 @@
           <wp:inline distB="114300" distT="114300" distL="114300" distR="114300">
             <wp:extent cx="5400675" cy="1028700"/>
             <wp:effectExtent b="0" l="0" r="0" t="0"/>
-            <wp:docPr id="2" name="image1.png"/>
+            <wp:docPr id="2" name="image6.png"/>
             <a:graphic>
               <a:graphicData uri="http://schemas.openxmlformats.org/drawingml/2006/picture">
                 <pic:pic>
                   <pic:nvPicPr>
-                    <pic:cNvPr id="0" name="image1.png"/>
+                    <pic:cNvPr id="0" name="image6.png"/>
                     <pic:cNvPicPr preferRelativeResize="0"/>
                   </pic:nvPicPr>
                   <pic:blipFill>
@@ -3125,7 +3125,7 @@
     </w:p>
     <w:sdt>
       <w:sdtPr>
-        <w:id w:val="1054416682"/>
+        <w:id w:val="107004319"/>
         <w:docPartObj>
           <w:docPartGallery w:val="Table of Contents"/>
           <w:docPartUnique w:val="1"/>
@@ -9131,12 +9131,12 @@
           <wp:inline distB="0" distT="0" distL="0" distR="0">
             <wp:extent cx="4480560" cy="7687458"/>
             <wp:effectExtent b="0" l="0" r="0" t="0"/>
-            <wp:docPr descr="System architecture diagram" id="1" name="image3.png"/>
+            <wp:docPr descr="System architecture diagram" id="4" name="image4.png"/>
             <a:graphic>
               <a:graphicData uri="http://schemas.openxmlformats.org/drawingml/2006/picture">
                 <pic:pic>
                   <pic:nvPicPr>
-                    <pic:cNvPr descr="System architecture diagram" id="0" name="image3.png"/>
+                    <pic:cNvPr descr="System architecture diagram" id="0" name="image4.png"/>
                     <pic:cNvPicPr preferRelativeResize="0"/>
                   </pic:nvPicPr>
                   <pic:blipFill>
@@ -9200,12 +9200,12 @@
           <wp:inline distB="0" distT="0" distL="0" distR="0">
             <wp:extent cx="4572000" cy="4575334"/>
             <wp:effectExtent b="0" l="0" r="0" t="0"/>
-            <wp:docPr descr="System architecture diagram" id="4" name="image4.png"/>
+            <wp:docPr descr="System architecture diagram" id="3" name="image1.png"/>
             <a:graphic>
               <a:graphicData uri="http://schemas.openxmlformats.org/drawingml/2006/picture">
                 <pic:pic>
                   <pic:nvPicPr>
-                    <pic:cNvPr descr="System architecture diagram" id="0" name="image4.png"/>
+                    <pic:cNvPr descr="System architecture diagram" id="0" name="image1.png"/>
                     <pic:cNvPicPr preferRelativeResize="0"/>
                   </pic:nvPicPr>
                   <pic:blipFill>
@@ -12934,12 +12934,12 @@
           <wp:inline distB="0" distT="0" distL="0" distR="0">
             <wp:extent cx="5303520" cy="3555523"/>
             <wp:effectExtent b="0" l="0" r="0" t="0"/>
-            <wp:docPr descr="Use case diagram: requisition and inventory management" id="3" name="image6.png"/>
+            <wp:docPr descr="Use case diagram: requisition and inventory management" id="6" name="image5.png"/>
             <a:graphic>
               <a:graphicData uri="http://schemas.openxmlformats.org/drawingml/2006/picture">
                 <pic:pic>
                   <pic:nvPicPr>
-                    <pic:cNvPr descr="Use case diagram: requisition and inventory management" id="0" name="image6.png"/>
+                    <pic:cNvPr descr="Use case diagram: requisition and inventory management" id="0" name="image5.png"/>
                     <pic:cNvPicPr preferRelativeResize="0"/>
                   </pic:nvPicPr>
                   <pic:blipFill>
@@ -13003,12 +13003,12 @@
           <wp:inline distB="0" distT="0" distL="0" distR="0">
             <wp:extent cx="5303520" cy="3025171"/>
             <wp:effectExtent b="0" l="0" r="0" t="0"/>
-            <wp:docPr descr="Use case diagram: access and user administration" id="6" name="image5.png"/>
+            <wp:docPr descr="Use case diagram: access and user administration" id="5" name="image3.png"/>
             <a:graphic>
               <a:graphicData uri="http://schemas.openxmlformats.org/drawingml/2006/picture">
                 <pic:pic>
                   <pic:nvPicPr>
-                    <pic:cNvPr descr="Use case diagram: access and user administration" id="0" name="image5.png"/>
+                    <pic:cNvPr descr="Use case diagram: access and user administration" id="0" name="image3.png"/>
                     <pic:cNvPicPr preferRelativeResize="0"/>
                   </pic:nvPicPr>
                   <pic:blipFill>
@@ -13072,7 +13072,7 @@
           <wp:inline distB="0" distT="0" distL="0" distR="0">
             <wp:extent cx="5303520" cy="4148110"/>
             <wp:effectExtent b="0" l="0" r="0" t="0"/>
-            <wp:docPr descr="Use case diagram: oversight and reporting" id="5" name="image2.png"/>
+            <wp:docPr descr="Use case diagram: oversight and reporting" id="1" name="image2.png"/>
             <a:graphic>
               <a:graphicData uri="http://schemas.openxmlformats.org/drawingml/2006/picture">
                 <pic:pic>
@@ -14376,7 +14376,7 @@
         <w:spacing w:after="160" w:before="280" w:lineRule="auto"/>
         <w:rPr/>
       </w:pPr>
-      <w:bookmarkStart w:colFirst="0" w:colLast="0" w:name="_6jjv04x6bf7j" w:id="0"/>
+      <w:bookmarkStart w:colFirst="0" w:colLast="0" w:name="_i0hpn32gdd0l" w:id="0"/>
       <w:bookmarkEnd w:id="0"/>
       <w:r>
         <w:rPr>
@@ -14934,7 +14934,7 @@
         <w:spacing w:after="160" w:before="280" w:lineRule="auto"/>
         <w:rPr/>
       </w:pPr>
-      <w:bookmarkStart w:colFirst="0" w:colLast="0" w:name="_qdkarmio2enu" w:id="1"/>
+      <w:bookmarkStart w:colFirst="0" w:colLast="0" w:name="_8ilyqdwi184z" w:id="1"/>
       <w:bookmarkEnd w:id="1"/>
       <w:r>
         <w:rPr>
@@ -14981,7 +14981,7 @@
         <w:spacing w:after="160" w:before="280" w:lineRule="auto"/>
         <w:rPr/>
       </w:pPr>
-      <w:bookmarkStart w:colFirst="0" w:colLast="0" w:name="_1zo94f398per" w:id="2"/>
+      <w:bookmarkStart w:colFirst="0" w:colLast="0" w:name="_cu4vq1dlvb3i" w:id="2"/>
       <w:bookmarkEnd w:id="2"/>
       <w:r>
         <w:rPr>
@@ -15028,7 +15028,7 @@
         <w:spacing w:after="160" w:before="280" w:lineRule="auto"/>
         <w:rPr/>
       </w:pPr>
-      <w:bookmarkStart w:colFirst="0" w:colLast="0" w:name="_mjyygvc4d0yz" w:id="3"/>
+      <w:bookmarkStart w:colFirst="0" w:colLast="0" w:name="_ho97nbafixgj" w:id="3"/>
       <w:bookmarkEnd w:id="3"/>
       <w:r>
         <w:rPr>
@@ -16170,7 +16170,6 @@
       <w:type w:val="nextPage"/>
       <w:pgSz w:h="16838" w:w="11906" w:orient="portrait"/>
       <w:pgMar w:bottom="1418" w:top="1418" w:left="1701" w:right="1418" w:header="708" w:footer="708"/>
-      <w:pgNumType w:start="1"/>
       <w:titlePg w:val="1"/>
     </w:sectPr>
   </w:body>
@@ -16208,8 +16207,16 @@
 <w:ftr xmlns:mc="http://schemas.openxmlformats.org/markup-compatibility/2006" xmlns:o="urn:schemas-microsoft-com:office:office" xmlns:r="http://schemas.openxmlformats.org/officeDocument/2006/relationships" xmlns:m="http://schemas.openxmlformats.org/officeDocument/2006/math" xmlns:v="urn:schemas-microsoft-com:vml" xmlns:wp="http://schemas.openxmlformats.org/drawingml/2006/wordprocessingDrawing" xmlns:w10="urn:schemas-microsoft-com:office:word" xmlns:w="http://schemas.openxmlformats.org/wordprocessingml/2006/main" xmlns:wne="http://schemas.microsoft.com/office/word/2006/wordml" xmlns:sl="http://schemas.openxmlformats.org/schemaLibrary/2006/main" xmlns:a="http://schemas.openxmlformats.org/drawingml/2006/main" xmlns:pic="http://schemas.openxmlformats.org/drawingml/2006/picture" xmlns:c="http://schemas.openxmlformats.org/drawingml/2006/chart" xmlns:lc="http://schemas.openxmlformats.org/drawingml/2006/lockedCanvas" xmlns:dgm="http://schemas.openxmlformats.org/drawingml/2006/diagram" xmlns:wps="http://schemas.microsoft.com/office/word/2010/wordprocessingShape" xmlns:wpg="http://schemas.microsoft.com/office/word/2010/wordprocessingGroup" xmlns:w14="http://schemas.microsoft.com/office/word/2010/wordml" xmlns:w15="http://schemas.microsoft.com/office/word/2012/wordml" xmlns:w16="http://schemas.microsoft.com/office/word/2018/wordml" xmlns:w16cex="http://schemas.microsoft.com/office/word/2018/wordml/cex" xmlns:w16cid="http://schemas.microsoft.com/office/word/2016/wordml/cid" xmlns="http://schemas.microsoft.com/office/tasks/2019/documenttasks" xmlns:cr="http://schemas.microsoft.com/office/comments/2020/reactions">
   <w:p>
     <w:pPr>
+      <w:jc w:val="right"/>
       <w:rPr/>
     </w:pPr>
+    <w:r>
+      <w:rPr/>
+      <w:fldChar w:fldCharType="begin"/>
+      <w:instrText xml:space="preserve">PAGE</w:instrText>
+      <w:fldChar w:fldCharType="separate"/>
+      <w:fldChar w:fldCharType="end"/>
+    </w:r>
     <w:r>
       <w:rPr>
         <w:rtl w:val="0"/>
@@ -16223,8 +16230,16 @@
 <w:ftr xmlns:mc="http://schemas.openxmlformats.org/markup-compatibility/2006" xmlns:o="urn:schemas-microsoft-com:office:office" xmlns:r="http://schemas.openxmlformats.org/officeDocument/2006/relationships" xmlns:m="http://schemas.openxmlformats.org/officeDocument/2006/math" xmlns:v="urn:schemas-microsoft-com:vml" xmlns:wp="http://schemas.openxmlformats.org/drawingml/2006/wordprocessingDrawing" xmlns:w10="urn:schemas-microsoft-com:office:word" xmlns:w="http://schemas.openxmlformats.org/wordprocessingml/2006/main" xmlns:wne="http://schemas.microsoft.com/office/word/2006/wordml" xmlns:sl="http://schemas.openxmlformats.org/schemaLibrary/2006/main" xmlns:a="http://schemas.openxmlformats.org/drawingml/2006/main" xmlns:pic="http://schemas.openxmlformats.org/drawingml/2006/picture" xmlns:c="http://schemas.openxmlformats.org/drawingml/2006/chart" xmlns:lc="http://schemas.openxmlformats.org/drawingml/2006/lockedCanvas" xmlns:dgm="http://schemas.openxmlformats.org/drawingml/2006/diagram" xmlns:wps="http://schemas.microsoft.com/office/word/2010/wordprocessingShape" xmlns:wpg="http://schemas.microsoft.com/office/word/2010/wordprocessingGroup" xmlns:w14="http://schemas.microsoft.com/office/word/2010/wordml" xmlns:w15="http://schemas.microsoft.com/office/word/2012/wordml" xmlns:w16="http://schemas.microsoft.com/office/word/2018/wordml" xmlns:w16cex="http://schemas.microsoft.com/office/word/2018/wordml/cex" xmlns:w16cid="http://schemas.microsoft.com/office/word/2016/wordml/cid" xmlns="http://schemas.microsoft.com/office/tasks/2019/documenttasks" xmlns:cr="http://schemas.microsoft.com/office/comments/2020/reactions">
   <w:p>
     <w:pPr>
+      <w:jc w:val="right"/>
       <w:rPr/>
     </w:pPr>
+    <w:r>
+      <w:rPr/>
+      <w:fldChar w:fldCharType="begin"/>
+      <w:instrText xml:space="preserve">PAGE</w:instrText>
+      <w:fldChar w:fldCharType="separate"/>
+      <w:fldChar w:fldCharType="end"/>
+    </w:r>
     <w:r>
       <w:rPr>
         <w:rtl w:val="0"/>

</xml_diff>

<commit_message>
Agent Host changes for agents/material-return-tagging-feature (#72)
</commit_message>
<xml_diff>
--- a/Yonas_Girma_Internship_Report_Revised.docx
+++ b/Yonas_Girma_Internship_Report_Revised.docx
@@ -19,12 +19,12 @@
           <wp:inline distB="114300" distT="114300" distL="114300" distR="114300">
             <wp:extent cx="5400675" cy="1028700"/>
             <wp:effectExtent b="0" l="0" r="0" t="0"/>
-            <wp:docPr id="2" name="image1.png"/>
+            <wp:docPr id="2" name="image6.png"/>
             <a:graphic>
               <a:graphicData uri="http://schemas.openxmlformats.org/drawingml/2006/picture">
                 <pic:pic>
                   <pic:nvPicPr>
-                    <pic:cNvPr id="0" name="image1.png"/>
+                    <pic:cNvPr id="0" name="image6.png"/>
                     <pic:cNvPicPr preferRelativeResize="0"/>
                   </pic:nvPicPr>
                   <pic:blipFill>
@@ -3125,7 +3125,7 @@
     </w:p>
     <w:sdt>
       <w:sdtPr>
-        <w:id w:val="1054416682"/>
+        <w:id w:val="107004319"/>
         <w:docPartObj>
           <w:docPartGallery w:val="Table of Contents"/>
           <w:docPartUnique w:val="1"/>
@@ -9131,12 +9131,12 @@
           <wp:inline distB="0" distT="0" distL="0" distR="0">
             <wp:extent cx="4480560" cy="7687458"/>
             <wp:effectExtent b="0" l="0" r="0" t="0"/>
-            <wp:docPr descr="System architecture diagram" id="1" name="image3.png"/>
+            <wp:docPr descr="System architecture diagram" id="4" name="image4.png"/>
             <a:graphic>
               <a:graphicData uri="http://schemas.openxmlformats.org/drawingml/2006/picture">
                 <pic:pic>
                   <pic:nvPicPr>
-                    <pic:cNvPr descr="System architecture diagram" id="0" name="image3.png"/>
+                    <pic:cNvPr descr="System architecture diagram" id="0" name="image4.png"/>
                     <pic:cNvPicPr preferRelativeResize="0"/>
                   </pic:nvPicPr>
                   <pic:blipFill>
@@ -9200,12 +9200,12 @@
           <wp:inline distB="0" distT="0" distL="0" distR="0">
             <wp:extent cx="4572000" cy="4575334"/>
             <wp:effectExtent b="0" l="0" r="0" t="0"/>
-            <wp:docPr descr="System architecture diagram" id="4" name="image4.png"/>
+            <wp:docPr descr="System architecture diagram" id="3" name="image1.png"/>
             <a:graphic>
               <a:graphicData uri="http://schemas.openxmlformats.org/drawingml/2006/picture">
                 <pic:pic>
                   <pic:nvPicPr>
-                    <pic:cNvPr descr="System architecture diagram" id="0" name="image4.png"/>
+                    <pic:cNvPr descr="System architecture diagram" id="0" name="image1.png"/>
                     <pic:cNvPicPr preferRelativeResize="0"/>
                   </pic:nvPicPr>
                   <pic:blipFill>
@@ -12934,12 +12934,12 @@
           <wp:inline distB="0" distT="0" distL="0" distR="0">
             <wp:extent cx="5303520" cy="3555523"/>
             <wp:effectExtent b="0" l="0" r="0" t="0"/>
-            <wp:docPr descr="Use case diagram: requisition and inventory management" id="3" name="image6.png"/>
+            <wp:docPr descr="Use case diagram: requisition and inventory management" id="6" name="image5.png"/>
             <a:graphic>
               <a:graphicData uri="http://schemas.openxmlformats.org/drawingml/2006/picture">
                 <pic:pic>
                   <pic:nvPicPr>
-                    <pic:cNvPr descr="Use case diagram: requisition and inventory management" id="0" name="image6.png"/>
+                    <pic:cNvPr descr="Use case diagram: requisition and inventory management" id="0" name="image5.png"/>
                     <pic:cNvPicPr preferRelativeResize="0"/>
                   </pic:nvPicPr>
                   <pic:blipFill>
@@ -13003,12 +13003,12 @@
           <wp:inline distB="0" distT="0" distL="0" distR="0">
             <wp:extent cx="5303520" cy="3025171"/>
             <wp:effectExtent b="0" l="0" r="0" t="0"/>
-            <wp:docPr descr="Use case diagram: access and user administration" id="6" name="image5.png"/>
+            <wp:docPr descr="Use case diagram: access and user administration" id="5" name="image3.png"/>
             <a:graphic>
               <a:graphicData uri="http://schemas.openxmlformats.org/drawingml/2006/picture">
                 <pic:pic>
                   <pic:nvPicPr>
-                    <pic:cNvPr descr="Use case diagram: access and user administration" id="0" name="image5.png"/>
+                    <pic:cNvPr descr="Use case diagram: access and user administration" id="0" name="image3.png"/>
                     <pic:cNvPicPr preferRelativeResize="0"/>
                   </pic:nvPicPr>
                   <pic:blipFill>
@@ -13072,7 +13072,7 @@
           <wp:inline distB="0" distT="0" distL="0" distR="0">
             <wp:extent cx="5303520" cy="4148110"/>
             <wp:effectExtent b="0" l="0" r="0" t="0"/>
-            <wp:docPr descr="Use case diagram: oversight and reporting" id="5" name="image2.png"/>
+            <wp:docPr descr="Use case diagram: oversight and reporting" id="1" name="image2.png"/>
             <a:graphic>
               <a:graphicData uri="http://schemas.openxmlformats.org/drawingml/2006/picture">
                 <pic:pic>
@@ -14376,7 +14376,7 @@
         <w:spacing w:after="160" w:before="280" w:lineRule="auto"/>
         <w:rPr/>
       </w:pPr>
-      <w:bookmarkStart w:colFirst="0" w:colLast="0" w:name="_6jjv04x6bf7j" w:id="0"/>
+      <w:bookmarkStart w:colFirst="0" w:colLast="0" w:name="_i0hpn32gdd0l" w:id="0"/>
       <w:bookmarkEnd w:id="0"/>
       <w:r>
         <w:rPr>
@@ -14934,7 +14934,7 @@
         <w:spacing w:after="160" w:before="280" w:lineRule="auto"/>
         <w:rPr/>
       </w:pPr>
-      <w:bookmarkStart w:colFirst="0" w:colLast="0" w:name="_qdkarmio2enu" w:id="1"/>
+      <w:bookmarkStart w:colFirst="0" w:colLast="0" w:name="_8ilyqdwi184z" w:id="1"/>
       <w:bookmarkEnd w:id="1"/>
       <w:r>
         <w:rPr>
@@ -14981,7 +14981,7 @@
         <w:spacing w:after="160" w:before="280" w:lineRule="auto"/>
         <w:rPr/>
       </w:pPr>
-      <w:bookmarkStart w:colFirst="0" w:colLast="0" w:name="_1zo94f398per" w:id="2"/>
+      <w:bookmarkStart w:colFirst="0" w:colLast="0" w:name="_cu4vq1dlvb3i" w:id="2"/>
       <w:bookmarkEnd w:id="2"/>
       <w:r>
         <w:rPr>
@@ -15028,7 +15028,7 @@
         <w:spacing w:after="160" w:before="280" w:lineRule="auto"/>
         <w:rPr/>
       </w:pPr>
-      <w:bookmarkStart w:colFirst="0" w:colLast="0" w:name="_mjyygvc4d0yz" w:id="3"/>
+      <w:bookmarkStart w:colFirst="0" w:colLast="0" w:name="_ho97nbafixgj" w:id="3"/>
       <w:bookmarkEnd w:id="3"/>
       <w:r>
         <w:rPr>
@@ -16170,7 +16170,6 @@
       <w:type w:val="nextPage"/>
       <w:pgSz w:h="16838" w:w="11906" w:orient="portrait"/>
       <w:pgMar w:bottom="1418" w:top="1418" w:left="1701" w:right="1418" w:header="708" w:footer="708"/>
-      <w:pgNumType w:start="1"/>
       <w:titlePg w:val="1"/>
     </w:sectPr>
   </w:body>
@@ -16208,8 +16207,16 @@
 <w:ftr xmlns:mc="http://schemas.openxmlformats.org/markup-compatibility/2006" xmlns:o="urn:schemas-microsoft-com:office:office" xmlns:r="http://schemas.openxmlformats.org/officeDocument/2006/relationships" xmlns:m="http://schemas.openxmlformats.org/officeDocument/2006/math" xmlns:v="urn:schemas-microsoft-com:vml" xmlns:wp="http://schemas.openxmlformats.org/drawingml/2006/wordprocessingDrawing" xmlns:w10="urn:schemas-microsoft-com:office:word" xmlns:w="http://schemas.openxmlformats.org/wordprocessingml/2006/main" xmlns:wne="http://schemas.microsoft.com/office/word/2006/wordml" xmlns:sl="http://schemas.openxmlformats.org/schemaLibrary/2006/main" xmlns:a="http://schemas.openxmlformats.org/drawingml/2006/main" xmlns:pic="http://schemas.openxmlformats.org/drawingml/2006/picture" xmlns:c="http://schemas.openxmlformats.org/drawingml/2006/chart" xmlns:lc="http://schemas.openxmlformats.org/drawingml/2006/lockedCanvas" xmlns:dgm="http://schemas.openxmlformats.org/drawingml/2006/diagram" xmlns:wps="http://schemas.microsoft.com/office/word/2010/wordprocessingShape" xmlns:wpg="http://schemas.microsoft.com/office/word/2010/wordprocessingGroup" xmlns:w14="http://schemas.microsoft.com/office/word/2010/wordml" xmlns:w15="http://schemas.microsoft.com/office/word/2012/wordml" xmlns:w16="http://schemas.microsoft.com/office/word/2018/wordml" xmlns:w16cex="http://schemas.microsoft.com/office/word/2018/wordml/cex" xmlns:w16cid="http://schemas.microsoft.com/office/word/2016/wordml/cid" xmlns="http://schemas.microsoft.com/office/tasks/2019/documenttasks" xmlns:cr="http://schemas.microsoft.com/office/comments/2020/reactions">
   <w:p>
     <w:pPr>
+      <w:jc w:val="right"/>
       <w:rPr/>
     </w:pPr>
+    <w:r>
+      <w:rPr/>
+      <w:fldChar w:fldCharType="begin"/>
+      <w:instrText xml:space="preserve">PAGE</w:instrText>
+      <w:fldChar w:fldCharType="separate"/>
+      <w:fldChar w:fldCharType="end"/>
+    </w:r>
     <w:r>
       <w:rPr>
         <w:rtl w:val="0"/>
@@ -16223,8 +16230,16 @@
 <w:ftr xmlns:mc="http://schemas.openxmlformats.org/markup-compatibility/2006" xmlns:o="urn:schemas-microsoft-com:office:office" xmlns:r="http://schemas.openxmlformats.org/officeDocument/2006/relationships" xmlns:m="http://schemas.openxmlformats.org/officeDocument/2006/math" xmlns:v="urn:schemas-microsoft-com:vml" xmlns:wp="http://schemas.openxmlformats.org/drawingml/2006/wordprocessingDrawing" xmlns:w10="urn:schemas-microsoft-com:office:word" xmlns:w="http://schemas.openxmlformats.org/wordprocessingml/2006/main" xmlns:wne="http://schemas.microsoft.com/office/word/2006/wordml" xmlns:sl="http://schemas.openxmlformats.org/schemaLibrary/2006/main" xmlns:a="http://schemas.openxmlformats.org/drawingml/2006/main" xmlns:pic="http://schemas.openxmlformats.org/drawingml/2006/picture" xmlns:c="http://schemas.openxmlformats.org/drawingml/2006/chart" xmlns:lc="http://schemas.openxmlformats.org/drawingml/2006/lockedCanvas" xmlns:dgm="http://schemas.openxmlformats.org/drawingml/2006/diagram" xmlns:wps="http://schemas.microsoft.com/office/word/2010/wordprocessingShape" xmlns:wpg="http://schemas.microsoft.com/office/word/2010/wordprocessingGroup" xmlns:w14="http://schemas.microsoft.com/office/word/2010/wordml" xmlns:w15="http://schemas.microsoft.com/office/word/2012/wordml" xmlns:w16="http://schemas.microsoft.com/office/word/2018/wordml" xmlns:w16cex="http://schemas.microsoft.com/office/word/2018/wordml/cex" xmlns:w16cid="http://schemas.microsoft.com/office/word/2016/wordml/cid" xmlns="http://schemas.microsoft.com/office/tasks/2019/documenttasks" xmlns:cr="http://schemas.microsoft.com/office/comments/2020/reactions">
   <w:p>
     <w:pPr>
+      <w:jc w:val="right"/>
       <w:rPr/>
     </w:pPr>
+    <w:r>
+      <w:rPr/>
+      <w:fldChar w:fldCharType="begin"/>
+      <w:instrText xml:space="preserve">PAGE</w:instrText>
+      <w:fldChar w:fldCharType="separate"/>
+      <w:fldChar w:fldCharType="end"/>
+    </w:r>
     <w:r>
       <w:rPr>
         <w:rtl w:val="0"/>

</xml_diff>